<commit_message>
feat: align with CSE3066 official rubric - 16 bugs across 5 categories, 13-column Bug Manifest, and Bug_Report tab
</commit_message>
<xml_diff>
--- a/NOP_BAI_DRIVE/Checklist_truoc_khi_nop.docx
+++ b/NOP_BAI_DRIVE/Checklist_truoc_khi_nop.docx
@@ -55,17 +55,17 @@
         <w:rPr>
           <w:b/>
         </w:rPr>
-        <w:t xml:space="preserve">Dự án: </w:t>
+        <w:t xml:space="preserve">Hệ thống: </w:t>
       </w:r>
       <w:r>
-        <w:t>SmartCalc Pro (Máy tính bỏ túi phục vụ kiểm thử phần mềm)</w:t>
+        <w:t>SmartCalc Pro (Web Application &amp; Testing)</w:t>
         <w:br/>
       </w:r>
       <w:r>
         <w:rPr>
           <w:b/>
         </w:rPr>
-        <w:t xml:space="preserve">Repository GitHub: </w:t>
+        <w:t xml:space="preserve">GitHub Repo: </w:t>
       </w:r>
       <w:r>
         <w:t>https://github.com/QUANGPV021/calculator-qa-testing</w:t>
@@ -75,7 +75,7 @@
         <w:rPr>
           <w:b/>
         </w:rPr>
-        <w:t xml:space="preserve">Trang web triển khai (GitHub Pages): </w:t>
+        <w:t xml:space="preserve">Website Live: </w:t>
       </w:r>
       <w:r>
         <w:t>https://quangpv021.github.io/calculator-qa-testing/</w:t>
@@ -92,47 +92,47 @@
         <w:pStyle w:val="Heading1"/>
       </w:pPr>
       <w:r>
-        <w:t>Danh sách các mục đã hoàn thành:</w:t>
+        <w:t>Danh sách kiểm tra các tiêu chí:</w:t>
       </w:r>
     </w:p>
     <w:p>
       <w:r>
-        <w:t>[x] 1. Khai báo Domain Website (GitHub Pages) tại phần About của Repository GitHub.</w:t>
+        <w:t>[x] 1. Khai báo Domain Website tại mục About của Repository GitHub.</w:t>
       </w:r>
     </w:p>
     <w:p>
       <w:r>
-        <w:t>[x] 2. Hoàn thành Mau_01_Tai_lieu_API.docx đầy đủ thông tin.</w:t>
+        <w:t>[x] 2. Hoàn thiện Mau_01_Tai_lieu_API.docx đầy đủ thông tin.</w:t>
       </w:r>
     </w:p>
     <w:p>
       <w:r>
-        <w:t>[x] 3. Hoàn thành Mau_02_Bug_Manifest.xlsx (10 bug trong đặc tả + 5 bug ngoài đặc tả).</w:t>
+        <w:t>[x] 3. Hoàn thiện Mau_02_Bug_Manifest.xlsx (16 lỗi chuẩn 5 nhóm, 10 trong đặc tả + 6 ngoài đặc tả).</w:t>
       </w:r>
     </w:p>
     <w:p>
       <w:r>
-        <w:t>[x] 4. Hoàn thành Mau_03_Bo_bieu_mau_Kiem_thu.xlsx (Bộ kịch bản kiểm thử).</w:t>
+        <w:t>[x] 4. Hoàn thiện Mau_03_Bo_bieu_mau_Kiem_thu.xlsx (tab Test_Cases và tab Bug_Report).</w:t>
       </w:r>
     </w:p>
     <w:p>
       <w:r>
-        <w:t>[x] 5. Hoàn thành Mau_04_Test_Plan.docx (Kế hoạch test).</w:t>
+        <w:t>[x] 5. Hoàn thiện Mau_04_Test_Plan.docx.</w:t>
       </w:r>
     </w:p>
     <w:p>
       <w:r>
-        <w:t>[x] 6. Hoàn thành Mau_05_Test_Summary_Report.docx (Tổng kết test).</w:t>
+        <w:t>[x] 6. Hoàn thiện Mau_05_Test_Summary_Report.docx.</w:t>
       </w:r>
     </w:p>
     <w:p>
       <w:r>
-        <w:t>[x] 7. Hoàn thành Mau_06_Bien_ban_ban_giao.docx.</w:t>
+        <w:t>[x] 7. Hoàn thiện Mau_06_Bien_ban_ban_giao.docx.</w:t>
       </w:r>
     </w:p>
     <w:p>
       <w:r>
-        <w:t>[x] 8. Tải đầy đủ toàn bộ file lên thư mục Google Drive cá nhân.</w:t>
+        <w:t>[x] 8. Tải đầy đủ 7 file lên thư mục Google Drive cá nhân: https://drive.google.com/drive/folders/1HGf_vFhYGt4W0uj3pWTIkBWyw_jsNvjv.</w:t>
       </w:r>
     </w:p>
     <w:sectPr>

</xml_diff>